<commit_message>
chore: update test document for validation testing
</commit_message>
<xml_diff>
--- a/test_paper.docx
+++ b/test_paper.docx
@@ -20,6 +20,7 @@
     <w:p>
       <w:pPr>
         <w:rPr>
+          <w:rFonts w:hint="eastAsia"/>
           <w:b/>
           <w:bCs/>
         </w:rPr>
@@ -38,15 +39,14 @@
         </w:rPr>
         <w:t xml:space="preserve"> </w:t>
       </w:r>
-      <w:proofErr w:type="gramStart"/>
-      <w:r>
-        <w:rPr>
-          <w:b/>
-          <w:bCs/>
-        </w:rPr>
-        <w:t>張覺意</w:t>
-      </w:r>
-      <w:proofErr w:type="gramEnd"/>
+      <w:r>
+        <w:rPr>
+          <w:rFonts w:hint="eastAsia"/>
+          <w:b/>
+          <w:bCs/>
+        </w:rPr>
+        <w:t>王大明</w:t>
+      </w:r>
     </w:p>
     <w:p>
       <w:pPr>
@@ -71,10 +71,11 @@
       </w:r>
       <w:r>
         <w:rPr>
-          <w:b/>
-          <w:bCs/>
-        </w:rPr>
-        <w:t>楊鎮華</w:t>
+          <w:rFonts w:hint="eastAsia"/>
+          <w:b/>
+          <w:bCs/>
+        </w:rPr>
+        <w:t>張大華</w:t>
       </w:r>
       <w:r>
         <w:rPr>
@@ -161,23 +162,7 @@
           <w:b/>
           <w:bCs/>
         </w:rPr>
-        <w:t>近年來，教育各項資源逐漸數位化，數位教育平台也逐漸</w:t>
-      </w:r>
-      <w:proofErr w:type="gramStart"/>
-      <w:r>
-        <w:rPr>
-          <w:b/>
-          <w:bCs/>
-        </w:rPr>
-        <w:t>普及，</w:t>
-      </w:r>
-      <w:proofErr w:type="gramEnd"/>
-      <w:r>
-        <w:rPr>
-          <w:b/>
-          <w:bCs/>
-        </w:rPr>
-        <w:t>學生的學習活動歷程也得以數位化，在傳統教學現場，教師要了解學生的閱讀理解能力，往往透過小考或一些課程互動，而在今日的數位平台中，如何量測學生的閱讀理解能力，是學習分析領域中一項重要的議題。</w:t>
+        <w:t>近年來，教育各項資源逐漸數位化，數位教育平台也逐漸普及，學生的學習活動歷程也得以數位化，在傳統教學現場，教師要了解學生的閱讀理解能力，往往透過小考或一些課程互動，而在今日的數位平台中，如何量測學生的閱讀理解能力，是學習分析領域中一項重要的議題。</w:t>
       </w:r>
     </w:p>
     <w:p>
@@ -206,39 +191,7 @@
           <w:b/>
           <w:bCs/>
         </w:rPr>
-        <w:t>領域在近年來得到顯著的突破，本文希望能利用當今最先進的自然語言處理技術，找出量測學生閱讀理解能力的最佳方法，</w:t>
-      </w:r>
-      <w:proofErr w:type="gramStart"/>
-      <w:r>
-        <w:rPr>
-          <w:b/>
-          <w:bCs/>
-        </w:rPr>
-        <w:t>此外，</w:t>
-      </w:r>
-      <w:proofErr w:type="gramEnd"/>
-      <w:r>
-        <w:rPr>
-          <w:b/>
-          <w:bCs/>
-        </w:rPr>
-        <w:t>教師欲了解學生的閱讀理解能力，通常透過批改學生的小考來達成，然而教師在出題與批改上往往耗費大量的時間和人力成本，本文透過自然語言處理技術將這兩</w:t>
-      </w:r>
-      <w:proofErr w:type="gramStart"/>
-      <w:r>
-        <w:rPr>
-          <w:b/>
-          <w:bCs/>
-        </w:rPr>
-        <w:t>個</w:t>
-      </w:r>
-      <w:proofErr w:type="gramEnd"/>
-      <w:r>
-        <w:rPr>
-          <w:b/>
-          <w:bCs/>
-        </w:rPr>
-        <w:t>步驟自動化，以利教師更快速地了解學生的閱讀理解能力。</w:t>
+        <w:t>領域在近年來得到顯著的突破，本文希望能利用當今最先進的自然語言處理技術，找出量測學生閱讀理解能力的最佳方法，此外，教師欲了解學生的閱讀理解能力，通常透過批改學生的小考來達成，然而教師在出題與批改上往往耗費大量的時間和人力成本，本文透過自然語言處理技術將這兩個步驟自動化，以利教師更快速地了解學生的閱讀理解能力。</w:t>
       </w:r>
     </w:p>
     <w:p>
@@ -267,23 +220,7 @@
           <w:b/>
           <w:bCs/>
         </w:rPr>
-        <w:t>自然語言處理、閱讀理解能力、自動評量、文字探</w:t>
-      </w:r>
-      <w:proofErr w:type="gramStart"/>
-      <w:r>
-        <w:rPr>
-          <w:b/>
-          <w:bCs/>
-        </w:rPr>
-        <w:t>勘</w:t>
-      </w:r>
-      <w:proofErr w:type="gramEnd"/>
-      <w:r>
-        <w:rPr>
-          <w:b/>
-          <w:bCs/>
-        </w:rPr>
-        <w:t>、預訓練模型</w:t>
+        <w:t>自然語言處理、閱讀理解能力、自動評量、文字探勘、預訓練模型</w:t>
       </w:r>
     </w:p>
     <w:p>
@@ -4075,15 +4012,15 @@
     <w:p>
       <w:pPr>
         <w:rPr>
-          <w:rFonts w:hint="eastAsia"/>
-          <w:b/>
-          <w:bCs/>
-        </w:rPr>
-      </w:pPr>
-      <w:r>
-        <w:rPr>
-          <w:b/>
-          <w:bCs/>
+          <w:b/>
+          <w:bCs/>
+        </w:rPr>
+      </w:pPr>
+      <w:r>
+        <w:rPr>
+          <w:b/>
+          <w:bCs/>
+          <w:noProof/>
         </w:rPr>
         <w:drawing>
           <wp:inline distT="0" distB="0" distL="0" distR="0" wp14:anchorId="0C873B62" wp14:editId="3AFDCCE8">
@@ -4997,21 +4934,12 @@
               </w:rPr>
               <w:t>week7_while</w:t>
             </w:r>
-            <w:proofErr w:type="gramStart"/>
-            <w:r>
-              <w:rPr>
-                <w:b/>
-                <w:bCs/>
-              </w:rPr>
-              <w:t>迴</w:t>
-            </w:r>
-            <w:proofErr w:type="gramEnd"/>
-            <w:r>
-              <w:rPr>
-                <w:b/>
-                <w:bCs/>
-              </w:rPr>
-              <w:t>圈</w:t>
+            <w:r>
+              <w:rPr>
+                <w:b/>
+                <w:bCs/>
+              </w:rPr>
+              <w:t>迴圈</w:t>
             </w:r>
           </w:p>
         </w:tc>
@@ -5444,23 +5372,7 @@
           <w:b/>
           <w:bCs/>
         </w:rPr>
-        <w:t>從結果可以看到我們的評分模型整體</w:t>
-      </w:r>
-      <w:proofErr w:type="gramStart"/>
-      <w:r>
-        <w:rPr>
-          <w:b/>
-          <w:bCs/>
-        </w:rPr>
-        <w:t>來說有不錯</w:t>
-      </w:r>
-      <w:proofErr w:type="gramEnd"/>
-      <w:r>
-        <w:rPr>
-          <w:b/>
-          <w:bCs/>
-        </w:rPr>
-        <w:t>的精準度，足以作為我們的代理度量。評分模型在</w:t>
+        <w:t>從結果可以看到我們的評分模型整體來說有不錯的精準度，足以作為我們的代理度量。評分模型在</w:t>
       </w:r>
       <w:r>
         <w:rPr>
@@ -5637,23 +5549,7 @@
           <w:b/>
           <w:bCs/>
         </w:rPr>
-        <w:t>Devlin, J., Chang, M. W., Lee, K., &amp; Toutanova, K. (2018). Bert: Pre-</w:t>
-      </w:r>
-      <w:proofErr w:type="gramStart"/>
-      <w:r>
-        <w:rPr>
-          <w:b/>
-          <w:bCs/>
-        </w:rPr>
-        <w:t>training of</w:t>
-      </w:r>
-      <w:proofErr w:type="gramEnd"/>
-      <w:r>
-        <w:rPr>
-          <w:b/>
-          <w:bCs/>
-        </w:rPr>
-        <w:t xml:space="preserve"> deep bidirectional transformers for language understanding. </w:t>
+        <w:t xml:space="preserve">Devlin, J., Chang, M. W., Lee, K., &amp; Toutanova, K. (2018). Bert: Pre-training of deep bidirectional transformers for language understanding. </w:t>
       </w:r>
       <w:r>
         <w:rPr>

</xml_diff>